<commit_message>
Bilder auf 1200px (100KB-1MB) skaliert; Abgabedokument mit Gruppendaten ausgefuellt
Co-Authored-By: Claude Opus 4.8 (1M context) <noreply@anthropic.com>
</commit_message>
<xml_diff>
--- a/Dokumentation/Dokumentation_M291_Kickback.docx
+++ b/Dokumentation/Dokumentation_M291_Kickback.docx
@@ -14,7 +14,7 @@
           <w:color w:val="0A0A0A"/>
           <w:sz w:val="22"/>
         </w:rPr>
-        <w:t>&lt;DATUM&gt;  |  &lt;KLASSE&gt;</w:t>
+        <w:t>12.06.2026  |  MMA23b</w:t>
       </w:r>
     </w:p>
     <w:p/>
@@ -105,7 +105,7 @@
           <w:color w:val="0A0A0A"/>
           <w:sz w:val="22"/>
         </w:rPr>
-        <w:t>&lt;VOLLSTÄNDIGE NAMEN DER GRUPPENMITGLIEDER&gt;</w:t>
+        <w:t>Bucher Tim, Krummenacher Livio, Stocker Joël, Häusler Joel</w:t>
       </w:r>
     </w:p>
     <w:p/>
@@ -213,7 +213,7 @@
     </w:p>
     <w:p>
       <w:r>
-        <w:t>Veröffentlichte Website: &lt;LINK-ZUR-VEROEFFENTLICHTEN-WEBSITE&gt;</w:t>
+        <w:t>Veröffentlichte Website: http://localhost:8080 (lokal lauffähig über Docker-Compose)</w:t>
       </w:r>
     </w:p>
     <w:p>

</xml_diff>